<commit_message>
Riscrive la didascalia di Casolari amalfitani sull'arco d'ingresso
Co-Authored-By: Claude Opus 5.5 <noreply@anthropic.com>
Claude-Session: https://claude.ai/code/session_0148bZgqQiCtdshijf84M1Qp
</commit_message>
<xml_diff>
--- a/testi-critici/artisti/bruno-apicella/word/opera-casolari-amalfitani.docx
+++ b/testi-critici/artisti/bruno-apicella/word/opera-casolari-amalfitani.docx
@@ -63,7 +63,7 @@
           <w:color w:val="1E1B18"/>
           <w:sz w:val="21"/>
         </w:rPr>
-        <w:t>Un arco di pietra, poi un altro, e in fondo al vicolo il mare. Fra muri fioriti, una lanterna e gradini consumati, lo sguardo viene accompagnato passo dopo passo verso l’azzurro: la Costiera come la si ricorda, un luogo in cui si torna anche solo con gli occhi.</w:t>
+        <w:t>Il grande arco di pietra in primo piano è una soglia: si entra nel quadro come in un borgo, e il vicolo fiorito porta, passo dopo passo, a un secondo arco aperto sul mare. Due porte in fila, e in fondo l’azzurro: la Costiera come la si ricorda, un luogo in cui si torna anche solo con gli occhi.</w:t>
       </w:r>
     </w:p>
     <w:p>
@@ -79,7 +79,7 @@
           <w:color w:val="6B645B"/>
           <w:sz w:val="18"/>
         </w:rPr>
-        <w:t>A stone arch, then another, and at the end of the alley the sea. Between flowering walls, a lantern and worn steps, the eye is led step by step towards the blue: the Coast as one remembers it, a place to return to, even if only with the eyes.</w:t>
+        <w:t>The great stone arch in the foreground is a threshold: one enters the painting as one enters a village, and the flowering alley leads, step by step, to a second arch open onto the sea. Two doorways in a row, and beyond them the blue: the Coast as one remembers it, a place to return to, even if only with the eyes.</w:t>
       </w:r>
     </w:p>
     <w:sectPr>

</xml_diff>